<commit_message>
Expand workspace: multi-article support, web corpus, IR frameworks, validators
Adds bilingual article pipeline (artikel-hi/arai/datacenter), web-retrieval
corpus tooling with manifests, IR article and citation frameworks, sintesa
diagram generators with figures, expanded source/subject registries, and
additional validator suite coverage (bab1, bagan, layout, web corpus).
</commit_message>
<xml_diff>
--- a/templates/journal-reference.docx
+++ b/templates/journal-reference.docx
@@ -519,6 +519,7 @@
     <w:qFormat/>
     <w:pPr>
       <w:spacing w:before="180" w:after="180"/>
+      <w:jc w:val="both"/>
     </w:pPr>
   </w:style>
   <w:style w:type="paragraph" w:customStyle="1" w:styleId="FirstParagraph">
@@ -526,6 +527,9 @@
     <w:basedOn w:val="BodyText"/>
     <w:next w:val="BodyText"/>
     <w:qFormat/>
+    <w:pPr>
+      <w:jc w:val="both"/>
+    </w:pPr>
   </w:style>
   <w:style w:type="paragraph" w:customStyle="1" w:styleId="Compact">
     <w:name w:val="Compact"/>
@@ -647,8 +651,10 @@
       <w:jc w:val="center"/>
     </w:pPr>
     <w:rPr>
+      <w:rFonts w:ascii="Times New Roman" w:hAnsi="Times New Roman" w:cs="Times New Roman"/>
       <w:b/>
-      <w:sz w:val="20"/>
+      <w:i w:val="0"/>
+      <w:sz w:val="22"/>
       <w:szCs w:val="20"/>
     </w:rPr>
   </w:style>
@@ -665,7 +671,7 @@
     </w:pPr>
     <w:rPr>
       <w:rFonts w:ascii="Times New Roman" w:hAnsi="Times New Roman" w:cs="Times New Roman"/>
-      <w:i/>
+      <w:i w:val="0"/>
       <w:sz w:val="20"/>
       <w:szCs w:val="20"/>
     </w:rPr>
@@ -690,7 +696,7 @@
       <w:keepNext/>
       <w:keepLines/>
       <w:spacing w:before="360" w:after="80"/>
-      <w:jc w:val="left"/>
+      <w:jc w:val="center"/>
       <w:outlineLvl w:val="0"/>
     </w:pPr>
     <w:rPr>
@@ -722,7 +728,7 @@
     <w:rPr>
       <w:rFonts w:asciiTheme="majorHAnsi" w:eastAsiaTheme="majorEastAsia" w:hAnsiTheme="majorHAnsi" w:cstheme="majorBidi" w:ascii="Times New Roman" w:hAnsi="Times New Roman" w:cs="Times New Roman"/>
       <w:b/>
-      <w:i/>
+      <w:i w:val="0"/>
       <w:color w:val="0F4761" w:themeColor="accent1" w:themeShade="BF"/>
       <w:sz w:val="22"/>
       <w:szCs w:val="32"/>
@@ -1160,6 +1166,42 @@
       <w:b w:val="0"/>
       <w:bCs w:val="0"/>
       <w:color w:val="365F91" w:themeColor="accent1" w:themeShade="BF"/>
+    </w:rPr>
+  </w:style>
+  <w:style w:type="paragraph" w:customStyle="1" w:styleId="SintaMasthead">
+    <w:name w:val="SintaMasthead"/>
+    <w:pPr>
+      <w:jc w:val="center"/>
+    </w:pPr>
+    <w:rPr>
+      <w:rFonts w:ascii="Times New Roman" w:hAnsi="Times New Roman" w:cs="Times New Roman"/>
+      <w:b w:val="0"/>
+      <w:i w:val="0"/>
+      <w:sz w:val="18"/>
+    </w:rPr>
+  </w:style>
+  <w:style w:type="paragraph" w:customStyle="1" w:styleId="SintaAffiliation">
+    <w:name w:val="SintaAffiliation"/>
+    <w:pPr>
+      <w:jc w:val="center"/>
+    </w:pPr>
+    <w:rPr>
+      <w:rFonts w:ascii="Times New Roman" w:hAnsi="Times New Roman" w:cs="Times New Roman"/>
+      <w:b w:val="0"/>
+      <w:i w:val="0"/>
+      <w:sz w:val="20"/>
+    </w:rPr>
+  </w:style>
+  <w:style w:type="paragraph" w:customStyle="1" w:styleId="SintaKeywords">
+    <w:name w:val="SintaKeywords"/>
+    <w:pPr>
+      <w:jc w:val="both"/>
+    </w:pPr>
+    <w:rPr>
+      <w:rFonts w:ascii="Times New Roman" w:hAnsi="Times New Roman" w:cs="Times New Roman"/>
+      <w:b w:val="0"/>
+      <w:i w:val="0"/>
+      <w:sz w:val="20"/>
     </w:rPr>
   </w:style>
 </w:styles>

</xml_diff>